<commit_message>
Finalize assignment compliance and ordered appendices
Co-authored-by: Harsh Kaushik <harsh-kaushikk@users.noreply.github.com>
</commit_message>
<xml_diff>
--- a/Final_Assignment_Harsh_Kaushik_17279659.docx
+++ b/Final_Assignment_Harsh_Kaushik_17279659.docx
@@ -278,6 +278,18 @@
       </w:r>
       <w:r>
         <w:t>4. Conclusion</w:t>
+      </w:r>
+      <w:r>
+        <w:br/>
+      </w:r>
+      <w:r>
+        <w:t>5. Appendix C: Role Descriptor (Part C3)</w:t>
+      </w:r>
+      <w:r>
+        <w:br/>
+      </w:r>
+      <w:r>
+        <w:t>6. Appendix D: AI Use Declaration</w:t>
       </w:r>
     </w:p>
     <w:p>
@@ -2984,7 +2996,7 @@
         <w:spacing w:after="100" w:line="276" w:lineRule="auto"/>
       </w:pPr>
       <w:r>
-        <w:t>Virgin Group's leadership challenge is not a lack of vision; it is the difficulty of translating entrepreneurial identity into consistent people leadership across a diversified portfolio. Founder-led narrative can mobilize markets and talent, but sustainable performance across multiple sectors depends on distributed leadership capability, cultural alignment, and learning systems that work beyond the top layer of leadership.</w:t>
+        <w:t>Virgin Group's central leadership paradox is that a globally recognized entrepreneurial brand can coexist with uneven day-to-day leadership quality across business units. In diversified portfolio structures, this gap is strategically significant: organizational performance is no longer determined only by flagship-level vision, but by distributed managerial capability, trust, learning speed, and retention outcomes at operating-unit level.</w:t>
       </w:r>
     </w:p>
     <w:p>
@@ -2992,7 +3004,7 @@
         <w:spacing w:after="100" w:line="276" w:lineRule="auto"/>
       </w:pPr>
       <w:r>
-        <w:t>Transformational leadership theory provides a useful starting point. Burns (1978) and Bass (1985) describe leadership influence through idealized influence, inspirational motivation, intellectual stimulation, and individualized consideration. Virgin's external brand identity strongly reflects the first two dimensions: purpose framing and bold strategic storytelling. However, in complex portfolio organizations, the risk is that inspiration remains concentrated at senior levels while individualized development and critical challenge quality vary across subsidiaries. Where middle-level leadership capability is uneven, employee experience, innovation rhythm, and retention can become uneven as well.</w:t>
+        <w:t>Transformational leadership theory provides the first diagnostic frame. Burns (1978) and Bass (1985) identify idealized influence, inspirational motivation, intellectual stimulation, and individualized consideration as core mechanisms of transformational impact. Virgin appears strong in symbolic leadership and purpose communication; however, portfolio consistency depends heavily on the latter two dimensions. Where middle-level leaders are rewarded predominantly for short-cycle delivery, individualized development and reflective challenge can weaken. This can produce a "narrative-performance disconnect": external brand confidence remains strong while internal capability depth develops unevenly across units.</w:t>
       </w:r>
     </w:p>
     <w:p>
@@ -3000,7 +3012,7 @@
         <w:spacing w:after="100" w:line="276" w:lineRule="auto"/>
       </w:pPr>
       <w:r>
-        <w:t>Heifetz's (1994) technical-adaptive distinction deepens this diagnosis. Virgin's current leadership pressures, such as retaining specialists in volatile sectors, managing inter-company learning, and balancing entrepreneurship with governance, are adaptive challenges. These cannot be solved by process controls alone. If treated as technical issues, interventions may produce visible activity but limited cultural movement.</w:t>
+        <w:t>Heifetz's (1994) technical-versus-adaptive distinction clarifies why conventional interventions often underperform. Virgin's key leadership pressures - cross-unit collaboration, specialist retention, innovation-governance balance, and cultural integration during expansion - are adaptive challenges rather than purely technical ones. They require shifts in behavior, authority use, and collective meaning, not just process redesign. If adaptive pressures are managed as technical problems, the organization may generate procedural activity without cultural movement, resulting in recurring patterns rather than resolution.</w:t>
       </w:r>
     </w:p>
     <w:p>
@@ -3008,7 +3020,7 @@
         <w:spacing w:after="100" w:line="276" w:lineRule="auto"/>
       </w:pPr>
       <w:r>
-        <w:t>Schein's (2010) cultural framework explains how this can happen. At the artefact level, Virgin projects innovation and customer disruption. At the espoused-values level, empowerment and agility are emphasized. Yet underlying assumptions in some business units may still prioritize short-cycle output over developmental leadership, open challenge, or capability transfer. This values-assumption gap can reduce trust because employees judge culture by daily leadership behavior rather than messaging.</w:t>
+        <w:t>Schein's (2010) three-level culture model reinforces this diagnosis. At artifact level, Virgin communicates innovation, customer orientation, and bold market positioning. At espoused-values level, empowerment and agility are highlighted. Yet underlying assumptions can diverge, especially where operational pressure encourages risk-avoidance, status protection, and weak upward challenge. When this mismatch persists, trust decays because employees evaluate culture through experienced leadership behavior rather than formal statements. Over time, this undermines discretionary effort and cross-functional knowledge sharing.</w:t>
       </w:r>
     </w:p>
     <w:p>
@@ -3016,7 +3028,7 @@
         <w:spacing w:after="100" w:line="276" w:lineRule="auto"/>
       </w:pPr>
       <w:r>
-        <w:t>Psychological safety is therefore central. Edmondson (1999) defines it as the shared belief that teams can take interpersonal risks without fear of punishment. In high-pressure, high-visibility ventures, low safety can suppress upward voice and early problem reporting. The consequence is not only people strain but learning failure. Argyris and Schön (1978) show that low-safety contexts tend toward single-loop learning: teams correct immediate errors but avoid questioning the assumptions that created those errors. Sustainable advantage requires double-loop learning, especially in uncertain environments.</w:t>
+        <w:t>Psychological safety is therefore a core performance variable, not a peripheral "people initiative." Edmondson (1999) defines psychological safety as a team-level climate in which interpersonal risk-taking is accepted. In volatile and high-visibility sectors, low safety reduces early warning quality because operational concerns are voiced late or filtered. This is directly linked to Argyris and Schon's (1978) distinction between single-loop and double-loop learning. Under low-safety conditions, organizations often correct immediate errors while protecting governing assumptions; as a result, root causes persist and learning loops remain shallow.</w:t>
       </w:r>
     </w:p>
     <w:p>
@@ -3024,7 +3036,7 @@
         <w:spacing w:after="100" w:line="276" w:lineRule="auto"/>
       </w:pPr>
       <w:r>
-        <w:t>Followership quality and relationship dynamics are equally important. Kelley (1992) argues organizations need exemplary followers who are both engaged and critically independent. If cultures over-reward compliance or heroic individualism, they can generate conformist or alienated followership patterns. LMX theory (Northouse, 2022) also indicates that unequal leadership access creates in-group and out-group effects, which influence promotion fairness, retention, and discretionary effort. In a group structure like Virgin's, these dynamics can surface between flagship ventures and less visible functions.</w:t>
+        <w:t>Followership quality further mediates performance outcomes. Kelley (1992) argues that resilient organizations develop exemplary followers who combine engagement with critical independent judgment. When reward systems implicitly prioritize compliance or political alignment, conformist or alienated followership patterns emerge. LMX theory also suggests that differentiated leader-member exchange can create in-group/out-group dynamics that shape perceived fairness, commitment, and retention (Northouse, 2022). In portfolio enterprises, such dynamics can become structural, with high-visibility units receiving disproportionate developmental attention relative to enabling functions.</w:t>
       </w:r>
     </w:p>
     <w:p>
@@ -3032,7 +3044,23 @@
         <w:spacing w:after="100" w:line="276" w:lineRule="auto"/>
       </w:pPr>
       <w:r>
-        <w:t>Senge's (1990) five disciplines offer a systems-level lens. Virgin's shared vision strength is clear, but long-term performance also depends on strengthening mental-model challenge and team learning across entities. Without this, businesses may innovate locally but fail to convert insights into institutional capability.</w:t>
+        <w:t>From a systems-learning perspective, Senge's (1990) five disciplines indicate both strengths and vulnerabilities. Shared vision appears relatively strong at group identity level; however, mental-model challenge and team learning across unit boundaries remain the critical constraints for long-term capability renewal. Without institutionalized cross-venture reflection routines, innovations remain localized and mistakes are repeated across the portfolio. Consequently, Virgin's leadership challenge should be interpreted as a performance architecture issue: not merely who leads, but how learning, authority, and development are distributed.</w:t>
+      </w:r>
+    </w:p>
+    <w:p>
+      <w:pPr>
+        <w:spacing w:after="100" w:line="276" w:lineRule="auto"/>
+      </w:pPr>
+      <w:r>
+        <w:t>The performance implications of these dynamics are material. Inconsistent people leadership quality typically manifests as uneven execution reliability, variable customer experience, and non-trivial replacement costs in high-skill roles. More importantly, it reduces strategic optionality: organizations with low internal trust and weak cross-unit learning are slower to redeploy talent, slower to integrate lessons from failed initiatives, and slower to scale emerging opportunities. In practical terms, leadership model weaknesses become enterprise capability weaknesses.</w:t>
+      </w:r>
+    </w:p>
+    <w:p>
+      <w:pPr>
+        <w:spacing w:after="100" w:line="276" w:lineRule="auto"/>
+      </w:pPr>
+      <w:r>
+        <w:t>A further issue concerns leadership legitimacy during expansion. In rapidly growing organizations, decision rights and accountability often diffuse faster than capability standards. Where legitimacy depends primarily on positional authority rather than developmental competence, managers can become throughput-focused administrators rather than adaptive leaders. This undermines long-horizon performance because teams optimize for immediate target compliance instead of institutional learning and capability accumulation.</w:t>
       </w:r>
     </w:p>
     <w:p>
@@ -3055,7 +3083,7 @@
         <w:spacing w:after="100" w:line="276" w:lineRule="auto"/>
       </w:pPr>
       <w:r>
-        <w:t>To maintain and improve organizational performance as Virgin expands, the strategy should integrate leadership behavior, capability architecture, and measurable governance.</w:t>
+        <w:t>To maintain and improve organizational performance as Virgin expands over the next decade, the proposed strategy integrates leadership standards, development infrastructure, and governance metrics into one portfolio-level model.</w:t>
       </w:r>
     </w:p>
     <w:p>
@@ -3063,7 +3091,16 @@
         <w:spacing w:after="100" w:line="276" w:lineRule="auto"/>
       </w:pPr>
       <w:r>
-        <w:t>First, establish a portfolio-wide leadership standard focused on coaching, challenge quality, developmental accountability, and inclusion. Local adaptation is necessary, but core expectations should be consistent. Second, use Situational Leadership II (Blanchard et al., 2013) to align management style with employee development levels D1-D4, preventing one-style leadership misfit. Third, deploy a learning architecture based on 70-20-10, supported by Kolb's experiential cycle and Knowles' andragogy (Kolb, 1984; Knowles, 1984). This means most development should occur through stretch assignments and cross-venture projects, reinforced by coaching and focused formal learning.</w:t>
+        <w:rPr>
+          <w:b/>
+        </w:rPr>
+        <w:t>A. Strategic alignment architecture.</w:t>
+      </w:r>
+      <w:r>
+        <w:br/>
+      </w:r>
+      <w:r>
+        <w:t>The first intervention is a group-wide leadership standard that translates strategy into observable behavior. The standard should define expectations across four domains: coaching quality, decision transparency, challenge invitation, and developmental accountability. This reduces role ambiguity and enables consistency without removing local autonomy. The strategic intent is to ensure that growth is not achieved at the expense of people-system fragility.</w:t>
       </w:r>
     </w:p>
     <w:p>
@@ -3071,7 +3108,16 @@
         <w:spacing w:after="100" w:line="276" w:lineRule="auto"/>
       </w:pPr>
       <w:r>
-        <w:t>Fourth, institutionalize psychological safety through explicit routines: set the stage for learning, invite participation, and respond productively to difficult information (Edmondson, 1999). These behaviors should appear in manager appraisal frameworks. Fifth, build a board-visible KPI dashboard that tracks voluntary turnover in critical roles, psychological safety scores, cross-venture mobility, coaching adoption, and succession depth. Reward systems should balance commercial outputs with organizational health outcomes so that short-term delivery does not come at long-term capability cost.</w:t>
+        <w:rPr>
+          <w:b/>
+        </w:rPr>
+        <w:t>B. Capability differentiation through SLII.</w:t>
+      </w:r>
+      <w:r>
+        <w:br/>
+      </w:r>
+      <w:r>
+        <w:t>Second, Situational Leadership II (SLII) should be adopted as a practical operating model for line managers (Blanchard et al., 2013). Matching style (directing, coaching, supporting, delegating) to development levels D1-D4 allows managers to avoid leadership-style lock-in. At scale, this can reduce capability bottlenecks by improving progression velocity in technical and managerial roles. SLII should be embedded in manager induction, performance dialogue templates, and promotion criteria to move it from training theory to daily practice.</w:t>
       </w:r>
     </w:p>
     <w:p>
@@ -3079,7 +3125,126 @@
         <w:spacing w:after="100" w:line="276" w:lineRule="auto"/>
       </w:pPr>
       <w:r>
-        <w:t>Strategically, this development approach supports both employee engagement and entrepreneurial resilience. It reduces dependence on personality-led leadership and builds scalable leadership capacity throughout the group.</w:t>
+        <w:rPr>
+          <w:b/>
+        </w:rPr>
+        <w:t>C. Portfolio learning system (70-20-10 + experiential integration).</w:t>
+      </w:r>
+      <w:r>
+        <w:br/>
+      </w:r>
+      <w:r>
+        <w:t>Third, development design should follow a 70-20-10 structure reinforced by Kolb's learning cycle and Knowles' adult-learning principles (Kolb, 1984; Knowles, 1984). Most capability formation should come from stretch assignments, secondments, and cross-venture delivery ownership (70), supported by mentoring and feedback-rich social learning (20), with targeted formal inputs (10). To avoid fragmented implementation, each business unit should maintain a leadership capability map tied to strategic risk and succession depth.</w:t>
+      </w:r>
+    </w:p>
+    <w:p>
+      <w:pPr>
+        <w:spacing w:after="100" w:line="276" w:lineRule="auto"/>
+      </w:pPr>
+      <w:r>
+        <w:rPr>
+          <w:b/>
+        </w:rPr>
+        <w:t>D. Psychological safety as an execution discipline.</w:t>
+      </w:r>
+      <w:r>
+        <w:br/>
+      </w:r>
+      <w:r>
+        <w:t>Fourth, Edmondson's three-stage approach should be operationalized: set the stage for learning, invite participation, and respond productively (Edmondson, 1999). This requires behavioral codification, not rhetorical endorsement. Manager scorecards should include leading indicators such as challenge frequency in team reviews, escalation latency, and quality of post-incident learning conversations. These indicators reduce the risk of compliance theater by linking safety to execution quality.</w:t>
+      </w:r>
+    </w:p>
+    <w:p>
+      <w:pPr>
+        <w:spacing w:after="100" w:line="276" w:lineRule="auto"/>
+      </w:pPr>
+      <w:r>
+        <w:rPr>
+          <w:b/>
+        </w:rPr>
+        <w:t>E. Governance, metrics, and accountability loops.</w:t>
+      </w:r>
+      <w:r>
+        <w:br/>
+      </w:r>
+      <w:r>
+        <w:t>Fifth, a board-visible people-performance dashboard should be introduced with quarterly review cadence. Core KPIs should include: voluntary turnover in critical talent pools, internal mobility rate across units, psychological safety index, manager coaching-quality score, leadership bench strength for priority roles, and time-to-productivity for promoted leaders. Incentive structures should balance commercial targets with people-system outcomes to prevent performance extraction behaviors that erode long-term capability.</w:t>
+      </w:r>
+    </w:p>
+    <w:p>
+      <w:pPr>
+        <w:spacing w:after="100" w:line="276" w:lineRule="auto"/>
+      </w:pPr>
+      <w:r>
+        <w:rPr>
+          <w:b/>
+        </w:rPr>
+        <w:t>Implementation pathway (2025-2035).</w:t>
+      </w:r>
+      <w:r>
+        <w:br/>
+      </w:r>
+      <w:r>
+        <w:t>Phase 1 (foundation) should define standards, baseline data, and pilot units. Phase 2 (scale) should institutionalize SLII and learning architecture across major business lines. Phase 3 (optimization) should focus on predictive analytics, succession resilience, and cross-venture leadership mobility. This staged approach supports strategic continuity while allowing adaptation to sector-specific conditions.</w:t>
+      </w:r>
+    </w:p>
+    <w:p>
+      <w:pPr>
+        <w:spacing w:after="100" w:line="276" w:lineRule="auto"/>
+      </w:pPr>
+      <w:r>
+        <w:rPr>
+          <w:b/>
+        </w:rPr>
+        <w:t>Operating mechanisms and review cadence.</w:t>
+      </w:r>
+      <w:r>
+        <w:br/>
+      </w:r>
+      <w:r>
+        <w:t>To avoid initiative fatigue, each strategic pillar should have a named executive owner, quarterly milestone targets, and defined evidence standards. A central leadership office can coordinate standards and analytics, while business-unit leaders retain adaptation authority for local context. Biannual portfolio reviews should test whether interventions are producing measurable movement in both capability and performance indicators, and should include explicit stop/scale decisions for underperforming interventions.</w:t>
+      </w:r>
+    </w:p>
+    <w:p>
+      <w:pPr>
+        <w:spacing w:after="100" w:line="276" w:lineRule="auto"/>
+      </w:pPr>
+      <w:r>
+        <w:rPr>
+          <w:b/>
+        </w:rPr>
+        <w:t>Risk controls for strategy execution.</w:t>
+      </w:r>
+      <w:r>
+        <w:br/>
+      </w:r>
+      <w:r>
+        <w:t>Three implementation risks require proactive mitigation. First, metric overload can dilute managerial attention; therefore, KPI sets should prioritize a small number of high-discrimination indicators. Second, training-completion bias can create false confidence; behavioral evidence from team practices should be weighted more heavily than attendance data. Third, incentive misalignment can quickly neutralize culture change; reward architecture must explicitly penalize short-term performance extraction that damages team sustainability.</w:t>
+      </w:r>
+    </w:p>
+    <w:p>
+      <w:pPr>
+        <w:spacing w:after="100" w:line="276" w:lineRule="auto"/>
+      </w:pPr>
+      <w:r>
+        <w:rPr>
+          <w:b/>
+        </w:rPr>
+        <w:t>Capability transfer across the portfolio.</w:t>
+      </w:r>
+      <w:r>
+        <w:br/>
+      </w:r>
+      <w:r>
+        <w:t>An additional design requirement is cross-venture capability transfer. Leadership development gains in one business unit should not remain locally trapped; they should be codified into reusable playbooks, peer-learning forums, and rotational assignments across entities. This transfer mechanism converts isolated improvements into enterprise capability. It also supports succession resilience by broadening leadership experience across different regulatory, operational, and market contexts within the Virgin portfolio.</w:t>
+      </w:r>
+    </w:p>
+    <w:p>
+      <w:pPr>
+        <w:spacing w:after="100" w:line="276" w:lineRule="auto"/>
+      </w:pPr>
+      <w:r>
+        <w:t>In sum, the strategy positions leadership development as a core operating system for portfolio resilience. It addresses the diagnosed adaptive challenge by aligning behavior, learning, and governance rather than relying on symbolic leadership alone. This approach is designed to sustain both commercial performance and human-system integrity as Virgin expands over the coming decade.</w:t>
       </w:r>
     </w:p>
     <w:p>
@@ -3211,7 +3376,7 @@
         <w:spacing w:after="100" w:line="276" w:lineRule="auto"/>
       </w:pPr>
       <w:r>
-        <w:t xml:space="preserve">The proposed initiative is </w:t>
+        <w:t xml:space="preserve">The entrepreneurial initiative proposed for Virgin Group is </w:t>
       </w:r>
       <w:r>
         <w:rPr>
@@ -3220,7 +3385,7 @@
         <w:t>Virgin NanoLaunch</w:t>
       </w:r>
       <w:r>
-        <w:t>, a spin-out focused on innovative, low-cost small-satellite launch systems. In strategic terms, this aligns with Schumpeter's (1942) creative-destruction logic: firms sustain long-term competitiveness by creating new value engines before existing ones mature. For Virgin, the opportunity is strong, but execution depends on whether management support is structured for uncertainty rather than for routine operations.</w:t>
+        <w:t>, a spin-out venture focused on innovative, low-cost small-satellite launch systems. Management support for this initiative should be assessed not as an abstract commitment to innovation, but as a concrete governance capability to make high-uncertainty decisions under strategic and regulatory constraints.</w:t>
       </w:r>
     </w:p>
     <w:p>
@@ -3228,7 +3393,7 @@
         <w:spacing w:after="100" w:line="276" w:lineRule="auto"/>
       </w:pPr>
       <w:r>
-        <w:t>Shane and Venkataraman (2000) frame entrepreneurship as opportunity recognition and exploitation under uncertainty. Demand signals in Earth observation, telecommunications, climate analytics, and defense-linked payloads support opportunity legitimacy. However, in large groups, opportunity conversion is often constrained by centralized control, risk aversion, or KPI systems optimized for stable business units.</w:t>
+        <w:t>Schumpeter's (1942) creative-destruction perspective suggests that established firms preserve long-term competitiveness by creating new growth engines before incumbent models plateau. For Virgin, a spin-out approach is strategically coherent because aerospace-adjacent opportunities demand different risk rhythms, investment logic, and capability architecture than mature service businesses. However, creative destruction is not self-executing: parent organizations frequently under-resource emerging ventures or over-control them through legacy performance systems.</w:t>
       </w:r>
     </w:p>
     <w:p>
@@ -3236,7 +3401,7 @@
         <w:spacing w:after="100" w:line="276" w:lineRule="auto"/>
       </w:pPr>
       <w:r>
-        <w:t>Strategic entrepreneurship requires balancing advantage-seeking in current businesses with opportunity-seeking in new domains (Ireland et al., 2003). Therefore, management should support NanoLaunch through semi-autonomous governance rather than fully integrating it into core operational controls. Sarasvathy's (2001) effectuation logic is appropriate here: begin with available means, run affordable-loss experiments, and refine direction through iterative evidence.</w:t>
+        <w:t>Shane and Venkataraman (2000) position entrepreneurship as opportunity recognition and exploitation under uncertainty. Current demand signals in earth observation, telecom infrastructure, climate analytics, and dual-use payload services indicate opportunity validity. Yet opportunity recognition in conglomerate contexts can be suppressed by centralized decision bottlenecks, narrow hurdle-rate expectations, and governance routines designed for incremental optimization rather than discovery. Therefore, management support should be judged by whether it enables high-quality experimentation, not by rhetorical commitment.</w:t>
       </w:r>
     </w:p>
     <w:p>
@@ -3244,7 +3409,7 @@
         <w:spacing w:after="100" w:line="276" w:lineRule="auto"/>
       </w:pPr>
       <w:r>
-        <w:t>A three-gate governance design (Cooper, 2008) provides practical structure. Gate 1 should evaluate technical feasibility and safety case maturity. Gate 2 should validate commercial demand through anchor-customer commitments and mission economics. Gate 3 should assess scale-readiness, including supply resilience, quality assurance, and compliance readiness. Each gate should include explicit continuation and termination criteria to prevent sunk-cost escalation.</w:t>
+        <w:t>Ireland, Hitt and Sirmon (2003) argue that strategic entrepreneurship requires simultaneous advantage-seeking and opportunity-seeking behavior. Applied here, Virgin must protect core business discipline while allocating protected exploratory capacity to NanoLaunch. A semi-autonomous governance model is therefore preferable to full integration. Operational autonomy should be granted in technical roadmap decisions, supplier experimentation, and partnership architecture, while parent-level governance focuses on capital discipline, safety boundaries, and strategic coherence.</w:t>
       </w:r>
     </w:p>
     <w:p>
@@ -3252,7 +3417,73 @@
         <w:spacing w:after="100" w:line="276" w:lineRule="auto"/>
       </w:pPr>
       <w:r>
-        <w:t>A focused PESTLE scan reinforces this direction. Political drivers include sovereign and security-linked space demand. Economic drivers include launch-cost pressure and new satellite-service markets. Social and environmental drivers include climate monitoring and connectivity use-cases. Technological drivers include miniaturized payload ecosystems. Legal and environmental factors include licensing, safety, and debris management obligations. The strategic implication is clear: management support should combine venture autonomy with disciplined risk governance.</w:t>
+        <w:t>Sarasvathy's (2001) effectuation logic provides an implementation method suited to uncertainty. NanoLaunch should begin with available means (brand credibility, engineering talent, commercial network), define affordable loss thresholds, and iterate through stakeholder commitments. This approach reduces dependence on speculative long-range forecasting and enables adaptive evidence accumulation. Effectuation is particularly relevant where technology maturation, procurement cycles, and regulation interact non-linearly.</w:t>
+      </w:r>
+    </w:p>
+    <w:p>
+      <w:pPr>
+        <w:spacing w:after="100" w:line="276" w:lineRule="auto"/>
+      </w:pPr>
+      <w:r>
+        <w:t>To operationalize support, a three-gate model should be used (Cooper, 2008).</w:t>
+      </w:r>
+      <w:r>
+        <w:br/>
+      </w:r>
+      <w:r>
+        <w:rPr>
+          <w:b/>
+        </w:rPr>
+        <w:t>Gate 1: Feasibility and safety readiness.</w:t>
+      </w:r>
+      <w:r>
+        <w:t xml:space="preserve"> Decision criteria: propulsion test reliability, early safety-case quality, and regulatory pre-engagement completeness.</w:t>
+      </w:r>
+      <w:r>
+        <w:br/>
+      </w:r>
+      <w:r>
+        <w:rPr>
+          <w:b/>
+        </w:rPr>
+        <w:t>Gate 2: Market and mission economics.</w:t>
+      </w:r>
+      <w:r>
+        <w:t xml:space="preserve"> Decision criteria: anchor-customer validation, mission success probability, and unit economics under conservative assumptions.</w:t>
+      </w:r>
+      <w:r>
+        <w:br/>
+      </w:r>
+      <w:r>
+        <w:rPr>
+          <w:b/>
+        </w:rPr>
+        <w:t>Gate 3: Scale and assurance readiness.</w:t>
+      </w:r>
+      <w:r>
+        <w:t xml:space="preserve"> Decision criteria: supply resilience, quality-system maturity, compliance evidence, and leadership capacity for scale transition.</w:t>
+      </w:r>
+      <w:r>
+        <w:br/>
+      </w:r>
+      <w:r>
+        <w:t>At each gate, stop/continue/pivot rules should be explicit to reduce sunk-cost escalation and governance ambiguity.</w:t>
+      </w:r>
+    </w:p>
+    <w:p>
+      <w:pPr>
+        <w:spacing w:after="100" w:line="276" w:lineRule="auto"/>
+      </w:pPr>
+      <w:r>
+        <w:t>A PESTLE scan further supports the venture case. Politically, sovereign capability priorities and space-security agendas support investment momentum. Economically, lower launch costs and expanding nano-satellite deployment increase addressable demand. Social and environmental drivers include climate monitoring, emergency-response analytics, and connectivity equity. Technologically, miniaturized payload ecosystems and rapid iteration platforms improve commercialization feasibility. Legally and environmentally, licensing, debris mitigation, and safety-assurance obligations remain stringent, reinforcing the need for disciplined governance.</w:t>
+      </w:r>
+    </w:p>
+    <w:p>
+      <w:pPr>
+        <w:spacing w:after="100" w:line="276" w:lineRule="auto"/>
+      </w:pPr>
+      <w:r>
+        <w:t>Overall, management support should combine venture autonomy with structured oversight. The recommended course of action is to launch NanoLaunch as a strategically sponsored spin-out with gated investment, effectual experimentation, and explicit safety-regulatory assurance milestones.</w:t>
       </w:r>
     </w:p>
     <w:p>
@@ -3275,7 +3506,7 @@
         <w:spacing w:after="100" w:line="276" w:lineRule="auto"/>
       </w:pPr>
       <w:r>
-        <w:t>Knight's (1921) distinction between risk and uncertainty is foundational. Some risks are quantifiable (component lead time, supplier concentration), while others remain uncertain (regulatory shifts, technology inflection timing). An effective framework therefore combines probabilistic controls with adaptive governance.</w:t>
+        <w:t>Knight's (1921) distinction between calculable risk and non-calculable uncertainty is essential for entrepreneurial ventures in aerospace contexts. NanoLaunch faces both: some exposure can be modeled statistically (e.g., supplier lead-time variability), while other exposure is fundamentally uncertain (e.g., abrupt policy shifts, competitor technology breakthroughs, or procurement behavior changes). A robust framework should therefore combine quantitative controls with adaptive governance mechanisms.</w:t>
       </w:r>
     </w:p>
     <w:p>
@@ -3283,7 +3514,7 @@
         <w:spacing w:after="100" w:line="276" w:lineRule="auto"/>
       </w:pPr>
       <w:r>
-        <w:t>The proposed seven-dimensional framework is as follows. Market risk should be managed through diversified customer mix, staged contracts, and demand-scenario planning. Technology risk should use Teece's (2007) dynamic capabilities logic: sense, seize, and reconfigure through iterative test-learning cycles. Financial risk should be managed with ISO 31000 appetite thresholds and milestone-linked funding (ISO, 2018). Regulatory risk requires compliance-by-design and early regulator engagement. Supply-chain risk requires dual sourcing where possible, critical-component watchlists, and quality traceability. Reputational risk requires transparent anomaly communication and conservative mission sequencing. Human-capital risk requires specialist retention architecture and psychologically safe technical culture linked directly to Part B recommendations.</w:t>
+        <w:t>The proposed model is a seven-dimensional, evidence-based risk architecture:</w:t>
       </w:r>
     </w:p>
     <w:p>
@@ -3291,7 +3522,126 @@
         <w:spacing w:after="100" w:line="276" w:lineRule="auto"/>
       </w:pPr>
       <w:r>
-        <w:t>The framework becomes actionable through a live risk register with named owners, trigger events, and trend review at board level. This moves risk management from static reporting to dynamic decision support.</w:t>
+        <w:rPr>
+          <w:b/>
+        </w:rPr>
+        <w:t>1) Market risk.</w:t>
+      </w:r>
+      <w:r>
+        <w:br/>
+      </w:r>
+      <w:r>
+        <w:t>Primary threats include adoption delay, pricing pressure, and concentration in a limited customer set. Mitigation should combine diversified segment targeting (commercial, public-sector, and mission-partner mixes), staged contracting, and scenario planning anchored to conservative demand assumptions. Affordable-loss logic from effectuation also reduces early over-commitment under uncertain demand (Sarasvathy, 2001).</w:t>
+      </w:r>
+    </w:p>
+    <w:p>
+      <w:pPr>
+        <w:spacing w:after="100" w:line="276" w:lineRule="auto"/>
+      </w:pPr>
+      <w:r>
+        <w:rPr>
+          <w:b/>
+        </w:rPr>
+        <w:t>2) Technology risk.</w:t>
+      </w:r>
+      <w:r>
+        <w:br/>
+      </w:r>
+      <w:r>
+        <w:t>Key exposures include propulsion reliability, integration failure, and subsystem dependency risk. Teece's (2007) dynamic capabilities model supports mitigation through continuous sensing (technical monitoring), seizing (resource reallocation to high-confidence pathways), and reconfiguration (roadmap revision based on test evidence). Test cadence discipline, failure taxonomy tracking, and design-for-learning principles are central.</w:t>
+      </w:r>
+    </w:p>
+    <w:p>
+      <w:pPr>
+        <w:spacing w:after="100" w:line="276" w:lineRule="auto"/>
+      </w:pPr>
+      <w:r>
+        <w:rPr>
+          <w:b/>
+        </w:rPr>
+        <w:t>3) Financial risk.</w:t>
+      </w:r>
+      <w:r>
+        <w:br/>
+      </w:r>
+      <w:r>
+        <w:t>Venture burn-rate escalation, funding gaps, and over-optimistic scale assumptions are material risks. ISO 31000-aligned risk appetite thresholds should be applied at each investment gate, with tranche release linked to verified technical and commercial milestones (International Organization for Standardization, 2018). This creates capital discipline while preserving strategic optionality.</w:t>
+      </w:r>
+    </w:p>
+    <w:p>
+      <w:pPr>
+        <w:spacing w:after="100" w:line="276" w:lineRule="auto"/>
+      </w:pPr>
+      <w:r>
+        <w:rPr>
+          <w:b/>
+        </w:rPr>
+        <w:t>4) Regulatory and compliance risk.</w:t>
+      </w:r>
+      <w:r>
+        <w:br/>
+      </w:r>
+      <w:r>
+        <w:t>Licensing complexity, export-control constraints, and safety-assurance evidence requirements can materially delay market entry. Mitigation requires compliance-by-design, regulator pre-consultation routines, and traceable evidence capture from early testing phases. The objective is to shift from reactive compliance to anticipatory regulatory strategy.</w:t>
+      </w:r>
+    </w:p>
+    <w:p>
+      <w:pPr>
+        <w:spacing w:after="100" w:line="276" w:lineRule="auto"/>
+      </w:pPr>
+      <w:r>
+        <w:rPr>
+          <w:b/>
+        </w:rPr>
+        <w:t>5) Supply-chain and operations risk.</w:t>
+      </w:r>
+      <w:r>
+        <w:br/>
+      </w:r>
+      <w:r>
+        <w:t>Critical component scarcity, quality variance, and single-source dependency threaten schedule and reliability. Mitigation should include dual-source policies where feasible, strategic inventory rules for long-lead components, supplier capability audits, and end-to-end configuration traceability.</w:t>
+      </w:r>
+    </w:p>
+    <w:p>
+      <w:pPr>
+        <w:spacing w:after="100" w:line="276" w:lineRule="auto"/>
+      </w:pPr>
+      <w:r>
+        <w:rPr>
+          <w:b/>
+        </w:rPr>
+        <w:t>6) Reputational risk.</w:t>
+      </w:r>
+      <w:r>
+        <w:br/>
+      </w:r>
+      <w:r>
+        <w:t>In safety-sensitive sectors, trust deterioration can have disproportionate strategic effects. Mission anomaly communication protocols, transparent incident-response governance, and conservative sequencing of first commercial missions reduce reputational fragility. Public trust should be treated as a strategic asset with explicit stewardship accountability.</w:t>
+      </w:r>
+    </w:p>
+    <w:p>
+      <w:pPr>
+        <w:spacing w:after="100" w:line="276" w:lineRule="auto"/>
+      </w:pPr>
+      <w:r>
+        <w:rPr>
+          <w:b/>
+        </w:rPr>
+        <w:t>7) Human-capital and leadership risk.</w:t>
+      </w:r>
+      <w:r>
+        <w:br/>
+      </w:r>
+      <w:r>
+        <w:t>Scarce specialist talent, burnout, and low psychological safety can degrade both innovation and reliability. This dimension should connect directly to Part B recommendations: leadership quality, challenge climate, and development pathways are not external to risk control; they are part of the risk system itself.</w:t>
+      </w:r>
+    </w:p>
+    <w:p>
+      <w:pPr>
+        <w:spacing w:after="100" w:line="276" w:lineRule="auto"/>
+      </w:pPr>
+      <w:r>
+        <w:t>For execution, these dimensions should be operationalized in a live risk register with named owners, trigger thresholds, response playbooks, and trend indicators. Governance should run on a monthly operating cadence and quarterly board review, with red-amber-green transitions tied to predefined escalation rules. In this model, risk management becomes a decision-support capability rather than retrospective reporting.</w:t>
       </w:r>
     </w:p>
     <w:p>
@@ -3314,7 +3664,7 @@
         <w:spacing w:after="100" w:line="276" w:lineRule="auto"/>
       </w:pPr>
       <w:r>
-        <w:t>Renko et al. (2015) define entrepreneurial leadership as mobilizing teams toward opportunity exploitation under uncertainty. This differs from conventional managerial leadership because the central challenge is not only execution efficiency but opportunity design, resource recombination, and decision quality under ambiguity.</w:t>
+        <w:t>Renko et al. (2015) define entrepreneurial leadership as the capability to influence and mobilize others toward opportunity exploitation under uncertainty. This is analytically distinct from conventional managerial leadership. In managerial contexts, variance reduction and process reliability may dominate; in entrepreneurial contexts, leaders must simultaneously design opportunities, allocate scarce resources under ambiguity, and preserve decision quality without complete information.</w:t>
       </w:r>
     </w:p>
     <w:p>
@@ -3322,22 +3672,15 @@
         <w:spacing w:after="100" w:line="276" w:lineRule="auto"/>
       </w:pPr>
       <w:r>
-        <w:t>For NanoLaunch, five attributes are critical. Kirznerian alertness (Kirzner, 1997) supports detection of under-served mission niches. Bricolage capability (Baker &amp; Nelson, 2005) supports resource recombination in constrained environments. Ambidexterity (Tushman &amp; O'Reilly, 1996) supports balance between exploration and selective leverage of parent capabilities. Structural-hole bridging (Burt, 2004) supports ecosystem influence across regulators, suppliers, technical partners, and anchor buyers. Psychological safety stewardship (Edmondson, 1999) supports early error reporting and constructive technical challenge.</w:t>
+        <w:t>For NanoLaunch, leadership effectiveness depends on whether the role holder can integrate discovery behavior with assurance discipline. The venture context requires strategic speed, but also evidence integrity in safety-critical development pathways. Therefore, entrepreneurial leadership here should not be interpreted as charismatic risk-taking; it should be assessed as high-quality judgment under uncertainty with accountable governance.</w:t>
       </w:r>
     </w:p>
     <w:p>
       <w:pPr>
-        <w:spacing w:before="100" w:after="80"/>
-        <w:jc w:val="left"/>
-      </w:pPr>
-      <w:r>
-        <w:rPr>
-          <w:rFonts w:ascii="Times New Roman" w:hAnsi="Times New Roman"/>
-          <w:b/>
-          <w:color w:val="191919"/>
-          <w:sz w:val="24"/>
-        </w:rPr>
-        <w:t>Role descriptor: Chief Entrepreneurial Officer, Virgin NanoLaunch</w:t>
+        <w:spacing w:after="100" w:line="276" w:lineRule="auto"/>
+      </w:pPr>
+      <w:r>
+        <w:t>Kirzner's (1997) alertness concept is particularly relevant to early market formation. The leader must detect under-served mission niches before they become visible in conventional demand metrics, including specialized payload classes, regional procurement windows, and partnership opportunities with non-traditional buyers. Alertness should be translated into systematic opportunity-scanning routines rather than ad hoc intuition.</w:t>
       </w:r>
     </w:p>
     <w:p>
@@ -3345,13 +3688,7 @@
         <w:spacing w:after="100" w:line="276" w:lineRule="auto"/>
       </w:pPr>
       <w:r>
-        <w:rPr>
-          <w:b/>
-        </w:rPr>
-        <w:t>Strategic purpose:</w:t>
-      </w:r>
-      <w:r>
-        <w:t xml:space="preserve"> Lead venture creation, validation, and scale-readiness while balancing innovation speed, reliability, and governance.</w:t>
+        <w:t>Baker and Nelson's (2005) bricolage perspective adds an operational discipline for constrained environments. NanoLaunch is unlikely to begin with unconstrained capital or complete resource sovereignty. The leader must therefore recombine existing Virgin assets - brand access, engineering capability, commercial relationships, and platform infrastructure - to create new value configurations while avoiding strategic dependency traps.</w:t>
       </w:r>
     </w:p>
     <w:p>
@@ -3359,49 +3696,7 @@
         <w:spacing w:after="100" w:line="276" w:lineRule="auto"/>
       </w:pPr>
       <w:r>
-        <w:rPr>
-          <w:b/>
-        </w:rPr>
-        <w:t>Competency cluster 1 (entrepreneurial cognition):</w:t>
-      </w:r>
-      <w:r>
-        <w:t xml:space="preserve"> opportunity recognition under uncertainty, affordable-loss judgment, market-sensing and pivot discipline.</w:t>
-      </w:r>
-      <w:r>
-        <w:br/>
-      </w:r>
-      <w:r>
-        <w:rPr>
-          <w:b/>
-        </w:rPr>
-        <w:t>Competency cluster 2 (technical-commercial integration):</w:t>
-      </w:r>
-      <w:r>
-        <w:t xml:space="preserve"> translation of technical milestones into commercial value, stage-gate discipline, mission assurance decision-making.</w:t>
-      </w:r>
-      <w:r>
-        <w:br/>
-      </w:r>
-      <w:r>
-        <w:rPr>
-          <w:b/>
-        </w:rPr>
-        <w:t>Competency cluster 3 (stakeholder orchestration):</w:t>
-      </w:r>
-      <w:r>
-        <w:t xml:space="preserve"> regulator engagement, partnership development, and investor/board communication under uncertainty.</w:t>
-      </w:r>
-      <w:r>
-        <w:br/>
-      </w:r>
-      <w:r>
-        <w:rPr>
-          <w:b/>
-        </w:rPr>
-        <w:t>Competency cluster 4 (culture leadership):</w:t>
-      </w:r>
-      <w:r>
-        <w:t xml:space="preserve"> psychological safety creation, cross-functional decision quality, and specialist talent retention.</w:t>
+        <w:t>Ambidexterity remains a core leadership requirement. Tushman and O'Reilly (1996) emphasize the need to balance exploration and exploitation. In this case, exploration relates to propulsion innovation, mission model experimentation, and evolving market entry pathways; exploitation relates to leveraging parent-group governance maturity, risk controls, and operational reliability standards. The leadership task is to prevent either logic from dominating to the detriment of the other.</w:t>
       </w:r>
     </w:p>
     <w:p>
@@ -3409,13 +3704,7 @@
         <w:spacing w:after="100" w:line="276" w:lineRule="auto"/>
       </w:pPr>
       <w:r>
-        <w:rPr>
-          <w:b/>
-        </w:rPr>
-        <w:t>Core KPIs:</w:t>
-      </w:r>
-      <w:r>
-        <w:t xml:space="preserve"> gate progression quality, reliability trend, customer commitment conversion, compliance milestone completion, team psychological safety and retention indicators.</w:t>
+        <w:t>Network orchestration capability is equally material. Burt's (2004) structural-hole theory explains how advantage can emerge when leaders bridge otherwise disconnected networks. For NanoLaunch, this means connecting regulators, component suppliers, research ecosystems, customers, and financiers into actionable collaboration architectures. Strategic social capital is therefore not peripheral; it is a venture-scaling mechanism.</w:t>
       </w:r>
     </w:p>
     <w:p>
@@ -3423,13 +3712,39 @@
         <w:spacing w:after="100" w:line="276" w:lineRule="auto"/>
       </w:pPr>
       <w:r>
-        <w:rPr>
-          <w:b/>
-        </w:rPr>
-        <w:t>Person specification:</w:t>
-      </w:r>
-      <w:r>
-        <w:t xml:space="preserve"> proven leadership in early-stage technology ventures, high competence in cross-functional stakeholder governance, strong ethical judgment, and demonstrated capability in operating under uncertainty.</w:t>
+        <w:t>Finally, entrepreneurial leadership in high-uncertainty technical environments must include psychological safety stewardship. Edmondson (1999) shows that learning quality depends on voice climate. In mission-critical engineering teams, latent defects and near misses must surface early. A leader who rewards only confidence signals and suppresses dissent increases operational fragility. A leader who normalizes challenge, evidence debate, and transparent error reporting improves both innovation and reliability.</w:t>
+      </w:r>
+    </w:p>
+    <w:p>
+      <w:pPr>
+        <w:spacing w:after="100" w:line="276" w:lineRule="auto"/>
+      </w:pPr>
+      <w:r>
+        <w:t>Beyond individual capability, role design must also account for governance interfaces. The venture leader operates at the boundary of strategic entrepreneurship and institutional assurance; therefore, decision rights should be explicit in relation to investment gates, safety thresholds, and partnership commitments. Ambiguity at these interfaces can cause either over-centralization (which suppresses opportunity learning) or under-governance (which increases downside risk). A high-quality role descriptor should therefore define not only competencies, but also authority boundaries, escalation rules, and accountability for evidence quality.</w:t>
+      </w:r>
+    </w:p>
+    <w:p>
+      <w:pPr>
+        <w:spacing w:after="100" w:line="276" w:lineRule="auto"/>
+      </w:pPr>
+      <w:r>
+        <w:t>Performance evaluation should similarly avoid narrow financial proxies in early phases. In discovery-intensive stages, indicators such as validated learning velocity, technical risk retirement rate, regulatory readiness maturity, and stakeholder commitment quality provide better signals than short-term revenue alone. As the venture moves toward scale, the evaluation mix should transition toward reliability, customer conversion, and capital efficiency metrics. This staged KPI logic ensures that leadership behavior remains aligned to venture lifecycle realities.</w:t>
+      </w:r>
+    </w:p>
+    <w:p>
+      <w:pPr>
+        <w:spacing w:after="100" w:line="276" w:lineRule="auto"/>
+      </w:pPr>
+      <w:r>
+        <w:t>The role also requires ethical decision quality under pressure. Venture leaders in data-intensive, safety-relevant domains routinely face trade-offs between speed, evidentiary completeness, and stakeholder confidence. A robust leadership profile therefore includes principled judgment, transparency in uncertainty communication, and willingness to defer launch decisions when assurance thresholds are not met. This strengthens long-term legitimacy and reduces the probability of strategic damage from preventable failures.</w:t>
+      </w:r>
+    </w:p>
+    <w:p>
+      <w:pPr>
+        <w:spacing w:after="100" w:line="276" w:lineRule="auto"/>
+      </w:pPr>
+      <w:r>
+        <w:t>Accordingly, the role descriptor for the venture leader has been developed as a formal appendix and is explicitly grounded in this analysis. The role descriptor (Appendix C) specifies strategic purpose, competency clusters, key performance indicators, and person specification criteria aligned to entrepreneurial theory and venture governance needs.</w:t>
       </w:r>
     </w:p>
     <w:p>
@@ -3452,7 +3767,7 @@
         <w:spacing w:after="100" w:line="276" w:lineRule="auto"/>
       </w:pPr>
       <w:r>
-        <w:t>GDPR and data/AI ethics can constrain rapid experimentation, but in regulated markets they are often strategic enablers when embedded from design stage. Constraint-side effects include Article 6 lawful-basis requirements, Article 22 safeguards around high-impact automated decisions, and retention/erasure tensions that limit unchecked data accumulation (European Union, 2016).</w:t>
+        <w:t>The relationship between GDPR/data ethics and entrepreneurial practice is best interpreted as a dual dynamic: regulation imposes constraints on speed and design flexibility, but can also create strategic advantage when integrated early. A balanced "to what extent" response therefore requires both sides of the argument.</w:t>
       </w:r>
     </w:p>
     <w:p>
@@ -3460,7 +3775,7 @@
         <w:spacing w:after="100" w:line="276" w:lineRule="auto"/>
       </w:pPr>
       <w:r>
-        <w:t>However, in enterprise procurement contexts, governance maturity is a trust signal. Strong privacy-by-design, traceability, and explainability can improve regulatory confidence, customer confidence, and investor confidence (Floridi et al., 2018). This is especially relevant for aerospace-adjacent operations where telemetry, safety analytics, and cross-border compliance can carry legal and reputational exposure.</w:t>
+        <w:t>On the constraint side, GDPR introduces non-trivial governance demands. Article 6 lawful-basis requirements can slow data-driven experimentation because collection and processing decisions must be justified before scale. Article 22 can constrain fully automated high-impact decision pipelines by requiring safeguards and, in certain cases, meaningful human oversight. Article 17 introduces retention-management complexity where long-horizon model development depends on longitudinal data continuity (European Union, 2016). In emerging ventures, these requirements can raise compliance overhead and extend cycle times if addressed late.</w:t>
       </w:r>
     </w:p>
     <w:p>
@@ -3468,7 +3783,7 @@
         <w:spacing w:after="100" w:line="276" w:lineRule="auto"/>
       </w:pPr>
       <w:r>
-        <w:t>The EU AI Act should also be considered in strategic planning because AI used in safety-critical industrial optimization may face high-risk obligations, including conformity assessment and governance controls. Although these requirements increase compliance effort, they can strengthen quality assurance and market credibility when implemented early.</w:t>
+        <w:t>The evolving AI regulatory landscape can intensify this effect. Under risk-based regimes such as the EU AI Act, AI components used in safety-sensitive operational environments may attract high-risk obligations, including assurance controls, documentation requirements, and conformity governance. For resource-constrained ventures, this can appear as a barrier to rapid deployment.</w:t>
       </w:r>
     </w:p>
     <w:p>
@@ -3476,7 +3791,32 @@
         <w:spacing w:after="100" w:line="276" w:lineRule="auto"/>
       </w:pPr>
       <w:r>
-        <w:t>Therefore, the practical verdict is balanced but clear: GDPR and AI ethics impose short-term process costs, yet they support long-term entrepreneurial viability by reducing hidden liability and increasing scalable trust. For NanoLaunch, ethics-by-design should be treated as venture infrastructure, not as late-stage compliance overhead.</w:t>
+        <w:t>However, the enabler argument is strategically strong in regulated B2B markets. Procurement decisions by enterprise and public-sector buyers increasingly include governance due diligence as a threshold condition. In this context, privacy-by-design, model traceability, and explainability are commercial trust assets rather than pure compliance burdens. Floridi et al. (2018) also emphasize that ethical design can increase legitimacy and strengthen innovation pathways by reducing adoption resistance and governance friction.</w:t>
+      </w:r>
+    </w:p>
+    <w:p>
+      <w:pPr>
+        <w:spacing w:after="100" w:line="276" w:lineRule="auto"/>
+      </w:pPr>
+      <w:r>
+        <w:t>For NanoLaunch, where operational telemetry, performance analytics, and cross-border data flows may intersect, ethics-by-design can improve regulatory readiness, investor confidence, and partnership quality. Early governance design reduces hidden liability, lowers remediation cost, and supports scalable growth architecture.</w:t>
+      </w:r>
+    </w:p>
+    <w:p>
+      <w:pPr>
+        <w:spacing w:after="100" w:line="276" w:lineRule="auto"/>
+      </w:pPr>
+      <w:r>
+        <w:t xml:space="preserve">Therefore, GDPR and AI ethics constrain short-term speed but support long-term venture resilience and market access. The extent is best characterized as </w:t>
+      </w:r>
+      <w:r>
+        <w:rPr>
+          <w:b/>
+        </w:rPr>
+        <w:t>temporarily restrictive but strategically enabling</w:t>
+      </w:r>
+      <w:r>
+        <w:t>: firms that internalize governance early are likely to move more credibly and sustainably than those that treat compliance as late-stage overhead.</w:t>
       </w:r>
     </w:p>
     <w:p>
@@ -3618,6 +3958,228 @@
       </w:pPr>
       <w:r>
         <w:t>This report addressed all required components of the assignment in one integrated document. Part A delivered a scenario-aligned ER design with relational schema conversion, SQL implementation, and a critical evaluation of the MySQL-to-MongoDB migration. Part B diagnosed leadership and cultural challenges using theory-led analysis and proposed a practical 2025-2035 leadership and people strategy linked to measurable outcomes. Part C appraised management support for a Virgin small-satellite launch spin-out, proposed a multi-dimensional risk framework, defined entrepreneurial leadership requirements, and delivered a balanced legal-ethical evaluation of GDPR and AI governance. Across all sections, the central argument is that long-term performance depends on aligning data architecture, leadership behavior, risk governance, and ethical legitimacy.</w:t>
+      </w:r>
+    </w:p>
+    <w:p>
+      <w:r>
+        <w:br w:type="page"/>
+      </w:r>
+    </w:p>
+    <w:p>
+      <w:pPr>
+        <w:spacing w:before="160" w:after="80"/>
+        <w:jc w:val="left"/>
+      </w:pPr>
+      <w:r>
+        <w:rPr>
+          <w:rFonts w:ascii="Times New Roman" w:hAnsi="Times New Roman"/>
+          <w:b/>
+          <w:color w:val="191919"/>
+          <w:sz w:val="32"/>
+        </w:rPr>
+        <w:t>Appendix C: Role Descriptor (Part C3 Requirement)</w:t>
+      </w:r>
+    </w:p>
+    <w:p>
+      <w:pPr>
+        <w:spacing w:after="100" w:line="276" w:lineRule="auto"/>
+      </w:pPr>
+      <w:r>
+        <w:rPr>
+          <w:b/>
+        </w:rPr>
+        <w:t>Role Title:</w:t>
+      </w:r>
+      <w:r>
+        <w:t xml:space="preserve"> Chief Entrepreneurial Officer, Virgin NanoLaunch</w:t>
+      </w:r>
+      <w:r>
+        <w:br/>
+      </w:r>
+      <w:r>
+        <w:rPr>
+          <w:b/>
+        </w:rPr>
+        <w:t>Strategic Purpose:</w:t>
+      </w:r>
+      <w:r>
+        <w:t xml:space="preserve"> Lead venture creation, validation, and scale-readiness while balancing innovation speed, reliability, and governance.</w:t>
+      </w:r>
+    </w:p>
+    <w:p>
+      <w:pPr>
+        <w:spacing w:after="100" w:line="276" w:lineRule="auto"/>
+      </w:pPr>
+      <w:r>
+        <w:rPr>
+          <w:b/>
+        </w:rPr>
+        <w:t>Competency Cluster 1 (entrepreneurial cognition):</w:t>
+      </w:r>
+      <w:r>
+        <w:t xml:space="preserve"> opportunity recognition under uncertainty, affordable-loss judgment, market-sensing and pivot discipline.</w:t>
+      </w:r>
+      <w:r>
+        <w:br/>
+      </w:r>
+      <w:r>
+        <w:rPr>
+          <w:b/>
+        </w:rPr>
+        <w:t>Competency Cluster 2 (technical-commercial integration):</w:t>
+      </w:r>
+      <w:r>
+        <w:t xml:space="preserve"> translation of technical milestones into commercial value, stage-gate discipline, mission assurance decision-making.</w:t>
+      </w:r>
+      <w:r>
+        <w:br/>
+      </w:r>
+      <w:r>
+        <w:rPr>
+          <w:b/>
+        </w:rPr>
+        <w:t>Competency Cluster 3 (stakeholder orchestration):</w:t>
+      </w:r>
+      <w:r>
+        <w:t xml:space="preserve"> regulator engagement, partnership development, and investor/board communication under uncertainty.</w:t>
+      </w:r>
+      <w:r>
+        <w:br/>
+      </w:r>
+      <w:r>
+        <w:rPr>
+          <w:b/>
+        </w:rPr>
+        <w:t>Competency Cluster 4 (culture leadership):</w:t>
+      </w:r>
+      <w:r>
+        <w:t xml:space="preserve"> psychological safety creation, cross-functional decision quality, and specialist talent retention.</w:t>
+      </w:r>
+    </w:p>
+    <w:p>
+      <w:pPr>
+        <w:spacing w:after="100" w:line="276" w:lineRule="auto"/>
+      </w:pPr>
+      <w:r>
+        <w:rPr>
+          <w:b/>
+        </w:rPr>
+        <w:t>Core KPIs:</w:t>
+      </w:r>
+      <w:r>
+        <w:t xml:space="preserve"> gate progression quality, reliability trend, customer commitment conversion, compliance milestone completion, team psychological safety and retention indicators.</w:t>
+      </w:r>
+    </w:p>
+    <w:p>
+      <w:pPr>
+        <w:spacing w:after="100" w:line="276" w:lineRule="auto"/>
+      </w:pPr>
+      <w:r>
+        <w:rPr>
+          <w:b/>
+        </w:rPr>
+        <w:t>Person Specification:</w:t>
+      </w:r>
+      <w:r>
+        <w:t xml:space="preserve"> proven leadership in early-stage technology ventures, high competence in cross-functional stakeholder governance, strong ethical judgment, and demonstrated capability in operating under uncertainty.</w:t>
+      </w:r>
+    </w:p>
+    <w:p>
+      <w:r>
+        <w:br w:type="page"/>
+      </w:r>
+    </w:p>
+    <w:p>
+      <w:pPr>
+        <w:spacing w:before="160" w:after="80"/>
+        <w:jc w:val="left"/>
+      </w:pPr>
+      <w:r>
+        <w:rPr>
+          <w:rFonts w:ascii="Times New Roman" w:hAnsi="Times New Roman"/>
+          <w:b/>
+          <w:color w:val="191919"/>
+          <w:sz w:val="32"/>
+        </w:rPr>
+        <w:t>Appendix D: AI Use Declaration</w:t>
+      </w:r>
+    </w:p>
+    <w:p>
+      <w:pPr>
+        <w:spacing w:after="100" w:line="276" w:lineRule="auto"/>
+      </w:pPr>
+      <w:r>
+        <w:t>This report was developed with limited AI support for planning and drafting assistance in line with module guidance for Amber-rated AI use.</w:t>
+      </w:r>
+    </w:p>
+    <w:p>
+      <w:pPr>
+        <w:spacing w:after="100" w:line="276" w:lineRule="auto"/>
+      </w:pPr>
+      <w:r>
+        <w:rPr>
+          <w:b/>
+        </w:rPr>
+        <w:t>Tool(s) used:</w:t>
+      </w:r>
+      <w:r>
+        <w:t xml:space="preserve"> conversational generative AI assistant (text drafting support).</w:t>
+      </w:r>
+      <w:r>
+        <w:br/>
+      </w:r>
+      <w:r>
+        <w:rPr>
+          <w:b/>
+        </w:rPr>
+        <w:t>How it was used:</w:t>
+      </w:r>
+      <w:r>
+        <w:br/>
+      </w:r>
+      <w:r>
+        <w:t>1. Generating outline structures for Parts A, B, and C.</w:t>
+      </w:r>
+      <w:r>
+        <w:br/>
+      </w:r>
+      <w:r>
+        <w:t>2. Suggesting alternative academic phrasing and transitions.</w:t>
+      </w:r>
+      <w:r>
+        <w:br/>
+      </w:r>
+      <w:r>
+        <w:t>3. Proposing candidate references and topic prompts for further manual verification.</w:t>
+      </w:r>
+    </w:p>
+    <w:p>
+      <w:pPr>
+        <w:spacing w:after="100" w:line="276" w:lineRule="auto"/>
+      </w:pPr>
+      <w:r>
+        <w:rPr>
+          <w:b/>
+        </w:rPr>
+        <w:t>How academic control was maintained by the student:</w:t>
+      </w:r>
+      <w:r>
+        <w:br/>
+      </w:r>
+      <w:r>
+        <w:t>1. The case analysis, argument selection, and final conclusions were chosen and edited by the student.</w:t>
+      </w:r>
+      <w:r>
+        <w:br/>
+      </w:r>
+      <w:r>
+        <w:t>2. All sections were reviewed and revised manually for alignment to the brief and guidance documents.</w:t>
+      </w:r>
+      <w:r>
+        <w:br/>
+      </w:r>
+      <w:r>
+        <w:t>3. References and evidence structures were checked and organized by the student before submission.</w:t>
       </w:r>
     </w:p>
     <w:sectPr>

</xml_diff>